<commit_message>
docs: presentation added and final touches
</commit_message>
<xml_diff>
--- a/Paper/SintezaEng2026.docx
+++ b/Paper/SintezaEng2026.docx
@@ -264,35 +264,7 @@
           <w:sz w:val="20"/>
           <w:szCs w:val="20"/>
         </w:rPr>
-        <w:t xml:space="preserve">This project involves modeling radiometric transport of light in a Digital Twin environment, with focus on predicting and analyzing lux-hours of light exposure experienced by heritage artifacts. This modeling process will entail exact geometrical occlusion to model light scattering directly and indirectly [1], </w:t>
-      </w:r>
-      <w:r>
-        <w:rPr>
-          <w:sz w:val="20"/>
-          <w:szCs w:val="20"/>
-        </w:rPr>
-        <w:t>and</w:t>
-      </w:r>
-      <w:r>
-        <w:rPr>
-          <w:sz w:val="20"/>
-          <w:szCs w:val="20"/>
-        </w:rPr>
-        <w:t xml:space="preserve"> the dynamical integration of solar ephemeris data </w:t>
-      </w:r>
-      <w:r>
-        <w:rPr>
-          <w:sz w:val="20"/>
-          <w:szCs w:val="20"/>
-        </w:rPr>
-        <w:t>to</w:t>
-      </w:r>
-      <w:r>
-        <w:rPr>
-          <w:sz w:val="20"/>
-          <w:szCs w:val="20"/>
-        </w:rPr>
-        <w:t xml:space="preserve"> predict future photometric damage to museum artifacts during the whole of the 8,760-hour long weather cycle.</w:t>
+        <w:t>This project involves modeling radiometric transport of light in a Digital Twin environment, with focus on predicting and analyzing lux-hours of light exposure experienced by heritage artifacts. This modeling process will entail exact geometrical occlusion to model light scattering directly and indirectly [1], and the dynamical integration of solar ephemeris data to predict future photometric damage to museum artifacts during the whole of the 8,760-hour long weather cycle.</w:t>
       </w:r>
     </w:p>
     <w:p>
@@ -444,23 +416,7 @@
           <w:szCs w:val="20"/>
           <w:lang w:val="en-GB"/>
         </w:rPr>
-        <w:t xml:space="preserve">: Implements DirectX 12 hardware acceleration </w:t>
-      </w:r>
-      <w:r>
-        <w:rPr>
-          <w:sz w:val="20"/>
-          <w:szCs w:val="20"/>
-          <w:lang w:val="en-GB"/>
-        </w:rPr>
-        <w:t>to</w:t>
-      </w:r>
-      <w:r>
-        <w:rPr>
-          <w:sz w:val="20"/>
-          <w:szCs w:val="20"/>
-          <w:lang w:val="en-GB"/>
-        </w:rPr>
-        <w:t xml:space="preserve"> bake accumulated irradiance onto UV Map of the target artifact indefinitely, hence bypassing the occlusion limitations associated with the traditional screen-space based techniques.</w:t>
+        <w:t>: Implements DirectX 12 hardware acceleration to bake accumulated irradiance onto UV Map of the target artifact indefinitely, hence bypassing the occlusion limitations associated with the traditional screen-space based techniques.</w:t>
       </w:r>
     </w:p>
     <w:p>
@@ -502,23 +458,46 @@
           <w:szCs w:val="20"/>
           <w:lang w:val="en-GB"/>
         </w:rPr>
-        <w:t xml:space="preserve">: A highly optimized C# thread calculates the equations for positioning of celestial bodies and atmospheric attenuation factor [4]. Exact values of solar vectors are fed into HLSL compute kernels </w:t>
-      </w:r>
-      <w:r>
-        <w:rPr>
-          <w:sz w:val="20"/>
-          <w:szCs w:val="20"/>
-          <w:lang w:val="en-GB"/>
-        </w:rPr>
-        <w:t>to</w:t>
-      </w:r>
-      <w:r>
-        <w:rPr>
-          <w:sz w:val="20"/>
-          <w:szCs w:val="20"/>
-          <w:lang w:val="en-GB"/>
-        </w:rPr>
-        <w:t xml:space="preserve"> provide a deterministic and precisely geographically synchronized GPU based simulation without interfering with the main thread.</w:t>
+        <w:t>: A highly optimized</w:t>
+      </w:r>
+      <w:r>
+        <w:rPr>
+          <w:sz w:val="20"/>
+          <w:szCs w:val="20"/>
+          <w:lang w:val="en-GB"/>
+        </w:rPr>
+        <w:t xml:space="preserve"> </w:t>
+      </w:r>
+      <w:r>
+        <w:rPr>
+          <w:sz w:val="20"/>
+          <w:szCs w:val="20"/>
+        </w:rPr>
+        <w:t>C# thread utilizes the rigorous </w:t>
+      </w:r>
+      <w:r>
+        <w:rPr>
+          <w:b/>
+          <w:bCs/>
+          <w:sz w:val="20"/>
+          <w:szCs w:val="20"/>
+        </w:rPr>
+        <w:t>NOAA (Blanco-Muriel) algorithm</w:t>
+      </w:r>
+      <w:r>
+        <w:rPr>
+          <w:sz w:val="20"/>
+          <w:szCs w:val="20"/>
+        </w:rPr>
+        <w:t> to calculate the equations for positioning of celestial bodies</w:t>
+      </w:r>
+      <w:r>
+        <w:rPr>
+          <w:sz w:val="20"/>
+          <w:szCs w:val="20"/>
+          <w:lang w:val="en-GB"/>
+        </w:rPr>
+        <w:t xml:space="preserve"> and atmospheric attenuation factor [4]. Exact values of solar vectors are fed into HLSL compute kernels to provide a deterministic and precisely geographically synchronized GPU based simulation without interfering with the main thread.</w:t>
       </w:r>
     </w:p>
     <w:p>
@@ -576,7 +555,7 @@
           <w:szCs w:val="20"/>
           <w:lang w:val="en-GB"/>
         </w:rPr>
-        <w:t xml:space="preserve"> properly simulate indirect light scattering effects, the compute kernel uses stochastic multi-sampling by means of Cosine-Weighted Importance Sampling [2] </w:t>
+        <w:t xml:space="preserve"> properly simulate indirect light scattering effects, the compute kernel uses stochastic multi-sampling by means of Cosine-Weighted Importance Sampling [2] to decrease variance. This technique is intrinsically linked with the mathematical calculation of the Perez All-Weather Sky Model [3] </w:t>
       </w:r>
       <w:r>
         <w:rPr>
@@ -592,39 +571,7 @@
           <w:szCs w:val="20"/>
           <w:lang w:val="en-GB"/>
         </w:rPr>
-        <w:t xml:space="preserve"> decrease variance. This technique is intrinsically linked with the mathematical calculation of the Perez All-Weather Sky Model [3] </w:t>
-      </w:r>
-      <w:r>
-        <w:rPr>
-          <w:sz w:val="20"/>
-          <w:szCs w:val="20"/>
-          <w:lang w:val="en-GB"/>
-        </w:rPr>
-        <w:t>to</w:t>
-      </w:r>
-      <w:r>
-        <w:rPr>
-          <w:sz w:val="20"/>
-          <w:szCs w:val="20"/>
-          <w:lang w:val="en-GB"/>
-        </w:rPr>
-        <w:t xml:space="preserve"> produce realistic relative luminance distribution on the sky dome </w:t>
-      </w:r>
-      <w:r>
-        <w:rPr>
-          <w:sz w:val="20"/>
-          <w:szCs w:val="20"/>
-          <w:lang w:val="en-GB"/>
-        </w:rPr>
-        <w:t>considering</w:t>
-      </w:r>
-      <w:r>
-        <w:rPr>
-          <w:sz w:val="20"/>
-          <w:szCs w:val="20"/>
-          <w:lang w:val="en-GB"/>
-        </w:rPr>
-        <w:t xml:space="preserve"> clear-sky turbidity parameters.</w:t>
+        <w:t xml:space="preserve"> produce realistic relative luminance distribution on the sky dome considering clear-sky turbidity parameters.</w:t>
       </w:r>
     </w:p>
     <w:p>
@@ -760,7 +707,14 @@
           <w:szCs w:val="20"/>
           <w:lang w:val="en-GB"/>
         </w:rPr>
-        <w:t xml:space="preserve"> called "Inferno," which capture the spatial hotspots; and organized </w:t>
+        <w:t xml:space="preserve"> called "Inferno," which capture the spatial hotspots; and organized</w:t>
+      </w:r>
+      <w:r>
+        <w:rPr>
+          <w:sz w:val="20"/>
+          <w:szCs w:val="20"/>
+        </w:rPr>
+        <w:t> CSV data files which extract </w:t>
       </w:r>
       <w:r>
         <w:rPr>
@@ -768,67 +722,70 @@
           <w:bCs/>
           <w:sz w:val="20"/>
           <w:szCs w:val="20"/>
-          <w:lang w:val="en-GB"/>
-        </w:rPr>
-        <w:t>CSV data</w:t>
-      </w:r>
-      <w:r>
-        <w:rPr>
-          <w:sz w:val="20"/>
-          <w:szCs w:val="20"/>
-          <w:lang w:val="en-GB"/>
-        </w:rPr>
-        <w:t xml:space="preserve"> files which contain </w:t>
-      </w:r>
-      <w:r>
-        <w:rPr>
-          <w:sz w:val="20"/>
-          <w:szCs w:val="20"/>
-          <w:lang w:val="en-GB"/>
-        </w:rPr>
-        <w:t>all</w:t>
-      </w:r>
-      <w:r>
-        <w:rPr>
-          <w:sz w:val="20"/>
-          <w:szCs w:val="20"/>
-          <w:lang w:val="en-GB"/>
-        </w:rPr>
-        <w:t xml:space="preserve"> the parameters for each simulated hour (i.e., Altitude, Azimuth, </w:t>
+        </w:rPr>
+        <w:t>21 granular metrics</w:t>
+      </w:r>
+      <w:r>
+        <w:rPr>
+          <w:sz w:val="20"/>
+          <w:szCs w:val="20"/>
+        </w:rPr>
+        <w:t> for each simulated hour (including separated </w:t>
+      </w:r>
+      <w:r>
+        <w:rPr>
+          <w:b/>
+          <w:bCs/>
+          <w:sz w:val="20"/>
+          <w:szCs w:val="20"/>
+        </w:rPr>
+        <w:t>Beam/Diffuse luminance</w:t>
+      </w:r>
+      <w:r>
+        <w:rPr>
+          <w:b/>
+          <w:bCs/>
+          <w:sz w:val="20"/>
+          <w:szCs w:val="20"/>
+        </w:rPr>
+        <w:t>, Direct and indirect lux</w:t>
+      </w:r>
+      <w:r>
+        <w:rPr>
+          <w:sz w:val="20"/>
+          <w:szCs w:val="20"/>
+        </w:rPr>
+        <w:t>, </w:t>
+      </w:r>
+      <w:r>
+        <w:rPr>
+          <w:b/>
+          <w:bCs/>
+          <w:sz w:val="20"/>
+          <w:szCs w:val="20"/>
+        </w:rPr>
+        <w:t>Surface Coverage</w:t>
+      </w:r>
+      <w:r>
+        <w:rPr>
+          <w:sz w:val="20"/>
+          <w:szCs w:val="20"/>
+        </w:rPr>
+        <w:t xml:space="preserve">, </w:t>
       </w:r>
       <w:proofErr w:type="spellStart"/>
       <w:r>
         <w:rPr>
           <w:sz w:val="20"/>
           <w:szCs w:val="20"/>
-          <w:lang w:val="en-GB"/>
-        </w:rPr>
-        <w:t>DeltaMax</w:t>
+        </w:rPr>
+        <w:t>MaxDose</w:t>
       </w:r>
       <w:proofErr w:type="spellEnd"/>
       <w:r>
         <w:rPr>
           <w:sz w:val="20"/>
           <w:szCs w:val="20"/>
-          <w:lang w:val="en-GB"/>
-        </w:rPr>
-        <w:t xml:space="preserve">, </w:t>
-      </w:r>
-      <w:proofErr w:type="spellStart"/>
-      <w:r>
-        <w:rPr>
-          <w:sz w:val="20"/>
-          <w:szCs w:val="20"/>
-          <w:lang w:val="en-GB"/>
-        </w:rPr>
-        <w:t>MaxDose</w:t>
-      </w:r>
-      <w:proofErr w:type="spellEnd"/>
-      <w:r>
-        <w:rPr>
-          <w:sz w:val="20"/>
-          <w:szCs w:val="20"/>
-          <w:lang w:val="en-GB"/>
         </w:rPr>
         <w:t>, and Variance).</w:t>
       </w:r>
@@ -1160,23 +1117,16 @@
           <w:szCs w:val="20"/>
           <w:lang w:val="en-GB"/>
         </w:rPr>
-        <w:t xml:space="preserve"> conservation </w:t>
-      </w:r>
-      <w:r>
-        <w:rPr>
-          <w:sz w:val="20"/>
-          <w:szCs w:val="20"/>
-          <w:lang w:val="en-GB"/>
-        </w:rPr>
-        <w:t>limits</w:t>
-      </w:r>
-      <w:r>
-        <w:rPr>
-          <w:sz w:val="20"/>
-          <w:szCs w:val="20"/>
-          <w:lang w:val="en-GB"/>
-        </w:rPr>
-        <w:t xml:space="preserve">. Additionally, the absolute peak was limited to </w:t>
+        <w:t xml:space="preserve"> conservation limits. </w:t>
+      </w:r>
+      <w:r>
+        <w:rPr>
+          <w:sz w:val="20"/>
+          <w:szCs w:val="20"/>
+          <w:lang w:val="en-GB"/>
+        </w:rPr>
+        <w:lastRenderedPageBreak/>
+        <w:t xml:space="preserve">Additionally, the absolute peak was limited to </w:t>
       </w:r>
       <w:r>
         <w:rPr>
@@ -1213,9 +1163,8 @@
         </w:rPr>
       </w:pPr>
       <w:r>
-        <w:lastRenderedPageBreak/>
         <w:pict w14:anchorId="695A56C6">
-          <v:shape id="_x0000_i1131" type="#_x0000_t75" style="width:211pt;height:143.5pt">
+          <v:shape id="_x0000_i1025" type="#_x0000_t75" style="width:210.75pt;height:2in">
             <v:imagedata r:id="rId9" o:title=""/>
           </v:shape>
         </w:pict>
@@ -1225,7 +1174,7 @@
       </w:r>
       <w:r>
         <w:pict w14:anchorId="5B69C67F">
-          <v:shape id="_x0000_i1130" type="#_x0000_t75" style="width:222pt;height:143.5pt">
+          <v:shape id="_x0000_i1026" type="#_x0000_t75" style="width:222pt;height:2in">
             <v:imagedata r:id="rId10" o:title=""/>
           </v:shape>
         </w:pict>
@@ -1299,7 +1248,38 @@
           <w:szCs w:val="20"/>
           <w:lang w:val="ro-RO"/>
         </w:rPr>
-        <w:t>guarantee thorough metrological validity in consideration of the considerable amount of dosage reduction that was mentioned above, the approach utilizes a set of hardware-accelerated Virtual Lux Sensors which asynchronously sample the raw 32-bit floating-point accumulation buffers. In this way, these sensors compute the spatial variance and the convergence error in a real-time manner.</w:t>
+        <w:t xml:space="preserve">guarantee thorough metrological validity in consideration of the considerable amount of dosage reduction that was mentioned above, </w:t>
+      </w:r>
+      <w:r>
+        <w:rPr>
+          <w:sz w:val="20"/>
+          <w:szCs w:val="20"/>
+        </w:rPr>
+        <w:t>the approach utilizes a set of hardware-accelerated Virtual Lux Sensors executing </w:t>
+      </w:r>
+      <w:r>
+        <w:rPr>
+          <w:b/>
+          <w:bCs/>
+          <w:sz w:val="20"/>
+          <w:szCs w:val="20"/>
+        </w:rPr>
+        <w:t>non-blocking GPU-to-CPU callbacks</w:t>
+      </w:r>
+      <w:r>
+        <w:rPr>
+          <w:sz w:val="20"/>
+          <w:szCs w:val="20"/>
+        </w:rPr>
+        <w:t> to asynchronously sample the raw 32-bit floating-point accumulation buffers.</w:t>
+      </w:r>
+      <w:r>
+        <w:rPr>
+          <w:sz w:val="20"/>
+          <w:szCs w:val="20"/>
+          <w:lang w:val="ro-RO"/>
+        </w:rPr>
+        <w:t>In this way, these sensors compute the spatial variance and the convergence error in a real-time manner.</w:t>
       </w:r>
     </w:p>
     <w:p>
@@ -1323,7 +1303,23 @@
           <w:szCs w:val="20"/>
           <w:lang w:val="ro-RO"/>
         </w:rPr>
-        <w:t xml:space="preserve">Analysis has shown that the spatial variance conforms to the laws of physics. Since the Standard Error of the Mean (SEM) is obtained from the spatial variance directly, it can be proven that the stochastic estimator converges consistently over the surface of the artifact in a mathematically divergent-free manner. The analytical percentage error of the virtual sensors, calculated through </w:t>
+        <w:t xml:space="preserve">Analysis has shown that the spatial variance conforms to the laws of physics. </w:t>
+      </w:r>
+      <w:r>
+        <w:rPr>
+          <w:sz w:val="20"/>
+          <w:szCs w:val="20"/>
+          <w:lang w:val="ro-RO"/>
+        </w:rPr>
+        <w:t>Since the spatial dose variance remains strictly constrained throughout the simulation, it can be mathematically proven that the stochastic estimator converges consistently over the surface of the artifact in a divergent-free manner.</w:t>
+      </w:r>
+      <w:r>
+        <w:rPr>
+          <w:sz w:val="20"/>
+          <w:szCs w:val="20"/>
+          <w:lang w:val="ro-RO"/>
+        </w:rPr>
+        <w:t xml:space="preserve">The analytical percentage error of the virtual sensors, calculated through </w:t>
       </w:r>
       <w:r>
         <w:rPr>
@@ -1358,7 +1354,7 @@
       </w:pPr>
       <w:r>
         <w:pict w14:anchorId="3BE6B6C7">
-          <v:shape id="_x0000_i1107" type="#_x0000_t75" style="width:199.5pt;height:162.5pt">
+          <v:shape id="_x0000_i1027" type="#_x0000_t75" style="width:199.5pt;height:162pt">
             <v:imagedata r:id="rId11" o:title=""/>
           </v:shape>
         </w:pict>
@@ -1368,7 +1364,7 @@
       </w:r>
       <w:r>
         <w:pict w14:anchorId="6BFAF7BD">
-          <v:shape id="_x0000_i1111" type="#_x0000_t75" style="width:202.5pt;height:164pt">
+          <v:shape id="_x0000_i1028" type="#_x0000_t75" style="width:202.5pt;height:164.25pt">
             <v:imagedata r:id="rId12" o:title=""/>
           </v:shape>
         </w:pict>

</xml_diff>